<commit_message>
feat: refactoring, test cases, enhancements
</commit_message>
<xml_diff>
--- a/deliverables/output/RIMSS - Solution Approach - v1.0.docx
+++ b/deliverables/output/RIMSS - Solution Approach - v1.0.docx
@@ -748,7 +748,7 @@
           </w:tcPr>
           <w:p>
             <w:r>
-              <w:t xml:space="preserve">Cart logic, filtering/search logic, pricing &amp; discount calculation</w:t>
+              <w:t xml:space="preserve">Cart logic, filtering/search logic, pricing &amp; discount calculation, cart persistence (localStorage), URL-synced filters</w:t>
             </w:r>
           </w:p>
         </w:tc>
@@ -780,7 +780,7 @@
           </w:tcPr>
           <w:p>
             <w:r>
-              <w:t xml:space="preserve">Talks to backend REST APIs with timeout, bounded retry/backoff; manages Web Push subscriptions</w:t>
+              <w:t xml:space="preserve">Talks to backend REST APIs with timeout, bounded retry/backoff (reads only), short-lived response cache; creates orders; manages Web Push subscriptions</w:t>
             </w:r>
           </w:p>
         </w:tc>
@@ -790,7 +790,7 @@
           </w:tcPr>
           <w:p>
             <w:r>
-              <w:t xml:space="preserve">Fetch-based clients (productService, httpClient, pushService)</w:t>
+              <w:t xml:space="preserve">Fetch-based clients (productService, orderService, httpClient, pushService)</w:t>
             </w:r>
           </w:p>
         </w:tc>
@@ -812,7 +812,7 @@
           </w:tcPr>
           <w:p>
             <w:r>
-              <w:t xml:space="preserve">Feature flags, telemetry sink, per-module error boundaries, skeleton/fallback UI, service worker (offline cache + push)</w:t>
+              <w:t xml:space="preserve">Feature flags, telemetry (beacon + global error capture), per-module error boundaries, skeleton/fallback UI, accessibility (focus-managed dialog, axe checks), CSP/security headers, service worker (offline cache + push)</w:t>
             </w:r>
           </w:p>
         </w:tc>
@@ -1023,7 +1023,7 @@
         <w:spacing w:after="60"/>
       </w:pPr>
       <w:r>
-        <w:t xml:space="preserve">User applies filters (category, price, color, discount, name) -&gt; pure filterProducts() re-filters client-side instantly</w:t>
+        <w:t xml:space="preserve">User applies filters (category, price, color, discount, name) -&gt; pure filterProducts() re-filters client-side instantly; the name box is debounced and all filters are mirrored into the URL so views are shareable</w:t>
       </w:r>
     </w:p>
     <w:p>
@@ -1049,20 +1049,20 @@
         <w:spacing w:after="60"/>
       </w:pPr>
       <w:r>
-        <w:t xml:space="preserve">User clicks Add to Cart -&gt; CartContext dispatches to pure cartLogic functions (addToCart, getCartTotal)</w:t>
-      </w:r>
-    </w:p>
-    <w:p>
-      <w:pPr>
-        <w:pStyle w:val="ListParagraph"/>
-        <w:numPr>
-          <w:ilvl w:val="0"/>
-          <w:numId w:val="1"/>
-        </w:numPr>
-        <w:spacing w:after="60"/>
-      </w:pPr>
-      <w:r>
-        <w:t xml:space="preserve">User opens cart drawer -&gt; reviews items, quantities, discounted totals -&gt; proceeds to Payment Gateway (integration point, out of scope)</w:t>
+        <w:t xml:space="preserve">User clicks Add to Cart -&gt; CartContext dispatches to pure cartLogic functions (addToCart, getCartTotal) and persists the cart to localStorage</w:t>
+      </w:r>
+    </w:p>
+    <w:p>
+      <w:pPr>
+        <w:pStyle w:val="ListParagraph"/>
+        <w:numPr>
+          <w:ilvl w:val="0"/>
+          <w:numId w:val="1"/>
+        </w:numPr>
+        <w:spacing w:after="60"/>
+      </w:pPr>
+      <w:r>
+        <w:t xml:space="preserve">User opens cart drawer -&gt; reviews items, quantities, discounted totals -&gt; places the order (orderService posts ids and quantities; the API prices it and returns an order id). The real payment gateway remains an integration point, out of scope</w:t>
       </w:r>
     </w:p>
     <w:p>

</xml_diff>

<commit_message>
feat: worked on the UI and performance
</commit_message>
<xml_diff>
--- a/deliverables/output/RIMSS - Solution Approach - v1.0.docx
+++ b/deliverables/output/RIMSS - Solution Approach - v1.0.docx
@@ -1179,7 +1179,7 @@
         <w:spacing w:after="60"/>
       </w:pPr>
       <w:r>
-        <w:t xml:space="preserve">Design system (styles/ + components/ui): SCSS variables/mixins and reusable Button, Card, Field, Heading and Table primitives keep modules visually consistent. Colour tokens are CSS custom properties, so a header toggle switches light and dark themes (persisted, defaults to the OS preference).</w:t>
+        <w:t xml:space="preserve">Design system (styles/ + components/ui): SCSS variables/mixins and reusable Button, Card, Field, Heading and Table primitives keep modules visually consistent. Colour tokens are CSS custom properties, so an avatar-menu toggle switches light and dark themes (persisted, defaults to the OS preference).</w:t>
       </w:r>
     </w:p>
     <w:p>
@@ -1601,7 +1601,7 @@
           </w:tcPr>
           <w:p>
             <w:r>
-              <w:t xml:space="preserve">Opt-in Web Push notifications (VAPID) via the service worker for offers and restocks; user can enable/disable from the header.</w:t>
+              <w:t xml:space="preserve">Opt-in Web Push notifications (VAPID) via the service worker for offers and restocks; user can enable/disable from the header avatar menu.</w:t>
             </w:r>
           </w:p>
         </w:tc>

</xml_diff>